<commit_message>
Reframe funnel entry as social post / Meta ad → sweepstakes giveaway
Per Ryan-pitch direction: the funnel entry point is a social media post
or Meta ad promoting a sweepstakes giveaway. Tightens this in three
places:

- Section 01 funnel diagram top stage: "A social media post or Meta ad
  → sweepstakes giveaway"
- Section 02 lede: explicitly names social post + Meta ad as the entry
- Section 02 step 1: rewrites the discovery moment around the
  Meta-ad-for-a-sweepstakes-giveaway hook, with a "Sponsored / Meta ·
  Instagram" label on the mock and "No purchase necessary. 18+." footer

DOCX rebuilt to match.

https://claude.ai/code/session_01NgrmyrUURmgUnf3KUyAJN1
</commit_message>
<xml_diff>
--- a/mvp-strategy/07-ryan-walkthrough.docx
+++ b/mvp-strategy/07-ryan-walkthrough.docx
@@ -238,7 +238,7 @@
                 <w:b/>
                 <w:sz w:val="22"/>
               </w:rPr>
-              <w:t>Sweepstakes capture fans from social</w:t>
+              <w:t>Social media post or Meta ad → sweepstakes giveaway</w:t>
             </w:r>
           </w:p>
         </w:tc>
@@ -252,7 +252,7 @@
               <w:rPr>
                 <w:sz w:val="20"/>
               </w:rPr>
-              <w:t>TikTok / Instagram / YouTube → "Win VIP fight experience" → Join Club MVP</w:t>
+              <w:t>Meta / TikTok / IG / YouTube · paid + fighter UGC → "Win VIP fight night" → Join Club MVP</w:t>
             </w:r>
           </w:p>
         </w:tc>
@@ -373,7 +373,7 @@
           <w:i w:val="0"/>
           <w:sz w:val="22"/>
         </w:rPr>
-        <w:t>Sweepstakes is the hook. Social is the channel. Mostvaluablepromotions.com is the destination. Account creation is the conversion. Four steps. Less than 60 seconds.</w:t>
+        <w:t>The fan enters the funnel through a social media post or Meta ad promoting a sweepstakes giveaway. They tap, land on mostvaluablepromotions.com, create a Club MVP account, and they're in. Four steps. Less than 60 seconds.</w:t>
       </w:r>
     </w:p>
     <w:p>
@@ -386,7 +386,7 @@
           <w:color w:val="38BDF8"/>
           <w:sz w:val="18"/>
         </w:rPr>
-        <w:t>DISCOVERY — ON SOCIAL</w:t>
+        <w:t>DISCOVERY — SOCIAL MEDIA POST OR META AD</w:t>
       </w:r>
     </w:p>
     <w:p>
@@ -396,7 +396,7 @@
           <w:color w:val="141414"/>
           <w:sz w:val="30"/>
         </w:rPr>
-        <w:t>1. Fan sees the sweepstakes on TikTok / Instagram / YouTube</w:t>
+        <w:t>1. Fan sees a sweepstakes giveaway in their feed</w:t>
       </w:r>
     </w:p>
     <w:p>
@@ -406,7 +406,7 @@
           <w:i w:val="0"/>
           <w:sz w:val="22"/>
         </w:rPr>
-        <w:t>Fighter selfies + paid media drive traffic. The hook is a real, big prize: "Win ringside seats + walkout access at the next MVP fight." Every social impression now has a chance to convert into a captured fan — not just a view.</w:t>
+        <w:t>The funnel entry point is a social media post or a Meta ad promoting a sweepstakes giveaway. Could be a fighter's organic post, MVP's owned channels, or a paid Meta / TikTok / YouTube ad — the hook is always the same: "Win VIP fight night, ringside seats, signed gloves, walkout access." That single tap on the post is how the fan enters the funnel.</w:t>
       </w:r>
     </w:p>
     <w:p>

</xml_diff>